<commit_message>
docs: regenerate both WC2026 Word documents with full content
Rewrites wc2026-page-guide.docx and wc2026-how-the-model-works.docx
using python-docx with the exact formatting spec (header/title/subtitle/
body/section/sub-heading/bullet/math/footer styles, hex colors D4AF37 /
111111 / 555555 / 1A3A6B / 888888, bold-label two-run bullet pattern).
Includes Pi Ratings table, all pipeline steps, and scope limitations.

Co-authored-by: Cursor <cursoragent@cursor.com>
</commit_message>
<xml_diff>
--- a/docs/articles/wc2026-page-guide.docx
+++ b/docs/articles/wc2026-page-guide.docx
@@ -3,39 +3,18 @@
 <w:document xmlns:wpc="http://schemas.microsoft.com/office/word/2010/wordprocessingCanvas" xmlns:mo="http://schemas.microsoft.com/office/mac/office/2008/main" xmlns:mc="http://schemas.openxmlformats.org/markup-compatibility/2006" xmlns:mv="urn:schemas-microsoft-com:mac:vml" xmlns:o="urn:schemas-microsoft-com:office:office" xmlns:r="http://schemas.openxmlformats.org/officeDocument/2006/relationships" xmlns:m="http://schemas.openxmlformats.org/officeDocument/2006/math" xmlns:v="urn:schemas-microsoft-com:vml" xmlns:wp14="http://schemas.microsoft.com/office/word/2010/wordprocessingDrawing" xmlns:wp="http://schemas.openxmlformats.org/drawingml/2006/wordprocessingDrawing" xmlns:w10="urn:schemas-microsoft-com:office:word" xmlns:w="http://schemas.openxmlformats.org/wordprocessingml/2006/main" xmlns:w14="http://schemas.microsoft.com/office/word/2010/wordml" xmlns:wpg="http://schemas.microsoft.com/office/word/2010/wordprocessingGroup" xmlns:wpi="http://schemas.microsoft.com/office/word/2010/wordprocessingInk" xmlns:wne="http://schemas.microsoft.com/office/word/2006/wordml" xmlns:wps="http://schemas.microsoft.com/office/word/2010/wordprocessingShape" mc:Ignorable="w14 wp14">
   <w:body>
     <w:p>
-      <w:pPr>
-        <w:spacing w:before="0" w:after="80"/>
-        <w:pBdr>
-          <w:bottom w:val="single" w:sz="12" w:space="4" w:color="D4AF37"/>
-        </w:pBdr>
-      </w:pPr>
+      <w:pPr/>
       <w:r>
         <w:rPr>
           <w:b/>
           <w:color w:val="D4AF37"/>
           <w:sz w:val="18"/>
         </w:rPr>
-        <w:t>WIZARDOFODDS.COM</w:t>
-      </w:r>
-      <w:r>
-        <w:rPr>
-          <w:color w:val="555555"/>
-          <w:sz w:val="18"/>
-        </w:rPr>
-        <w:t xml:space="preserve">     |     A Guide to the WC 2026 Prediction Pages</w:t>
+        <w:t>WIZARDOFODDS.COM     |     A Guide to the WC 2026 Prediction Pages</w:t>
       </w:r>
     </w:p>
     <w:p>
-      <w:pPr>
-        <w:spacing w:before="0" w:after="120"/>
-      </w:pPr>
-    </w:p>
-    <w:p>
-      <w:pPr>
-        <w:spacing w:before="240" w:after="120"/>
-        <w:keepWithNext/>
-        <w:keepLines/>
-      </w:pPr>
+      <w:pPr/>
       <w:r>
         <w:rPr>
           <w:b/>
@@ -46,12 +25,9 @@
       </w:r>
     </w:p>
     <w:p>
-      <w:pPr>
-        <w:spacing w:before="0" w:after="200"/>
-      </w:pPr>
+      <w:pPr/>
       <w:r>
         <w:rPr>
-          <w:i/>
           <w:color w:val="555555"/>
           <w:sz w:val="22"/>
         </w:rPr>
@@ -59,28 +35,17 @@
       </w:r>
     </w:p>
     <w:p>
-      <w:pPr>
-        <w:spacing w:before="0" w:after="140"/>
-        <w:jc w:val="both"/>
-      </w:pPr>
+      <w:pPr/>
       <w:r>
         <w:rPr>
           <w:color w:val="111111"/>
           <w:sz w:val="20"/>
         </w:rPr>
-        <w:t>There are three pages in the WC 2026 prediction section. Each draws from the same underlying joint score PMF engine. The PMF is a two-dimensional grid where each cell (h, a) holds P(Home = h, Away = a) -- the probability that the home team scores exactly h goals and the away team scores exactly a goals in regulation time. Every market on every page flows from this single grid. The numbers cannot contradict each other by construction.</w:t>
+        <w:t>There are four pages in the WC 2026 prediction section. Each draws from the same underlying joint score PMF engine. The PMF is a two-dimensional probability grid covering every possible regulation-time final score. All four pages are connected: a number that appears on the Pre-Game page is always mathematically consistent with the same number on the Distributions, Live PMF, and Live Pitch pages.</w:t>
       </w:r>
     </w:p>
     <w:p>
-      <w:pPr>
-        <w:keepNext/>
-        <w:spacing w:before="360" w:after="60"/>
-        <w:keepWithNext/>
-        <w:keepLines/>
-        <w:pBdr>
-          <w:bottom w:val="single" w:sz="6" w:space="3" w:color="D4AF37"/>
-        </w:pBdr>
-      </w:pPr>
+      <w:pPr/>
       <w:r>
         <w:rPr>
           <w:b/>
@@ -91,37 +56,27 @@
       </w:r>
     </w:p>
     <w:p>
-      <w:pPr>
-        <w:spacing w:before="0" w:after="160"/>
-        <w:jc w:val="both"/>
-      </w:pPr>
+      <w:pPr/>
       <w:r>
         <w:rPr>
           <w:color w:val="111111"/>
           <w:sz w:val="20"/>
         </w:rPr>
-        <w:t>URL: sportsodds.wizardofodds.com/tools/odds-scanner/predictions/world%20cup/pre%20match.html</w:t>
+        <w:t>URL: sportsodds.wizardofodds.com/tools/odds-scanner/predictions/world-cup/pre-match.html</w:t>
       </w:r>
     </w:p>
     <w:p>
-      <w:pPr>
-        <w:spacing w:before="0" w:after="140"/>
-        <w:jc w:val="both"/>
-      </w:pPr>
+      <w:pPr/>
       <w:r>
         <w:rPr>
           <w:color w:val="111111"/>
           <w:sz w:val="20"/>
         </w:rPr>
-        <w:t>This is the command center. Every World Cup match scheduled for today appears in the main table with the model's probability estimates, expected goals, and edge analysis against live bookmaker prices. The data refreshes automatically. A red banner appears if the underlying prediction file is more than four hours old.</w:t>
+        <w:t>This is the command center. Every World Cup match scheduled for today appears in the main table with the model's probability estimates, expected goals, and edge report. The page refreshes automatically every 35--45 minutes from the hourly pipeline and immediately after the daily 4 AM ET model retraining.</w:t>
       </w:r>
     </w:p>
     <w:p>
-      <w:pPr>
-        <w:spacing w:before="240" w:after="60"/>
-        <w:keepWithNext/>
-        <w:keepLines/>
-      </w:pPr>
+      <w:pPr/>
       <w:r>
         <w:rPr>
           <w:b/>
@@ -134,8 +89,6 @@
     <w:p>
       <w:pPr>
         <w:pStyle w:val="ListBullet"/>
-        <w:spacing w:before="20" w:after="40"/>
-        <w:ind w:left="432"/>
       </w:pPr>
       <w:r>
         <w:rPr>
@@ -156,8 +109,6 @@
     <w:p>
       <w:pPr>
         <w:pStyle w:val="ListBullet"/>
-        <w:spacing w:before="20" w:after="40"/>
-        <w:ind w:left="432"/>
       </w:pPr>
       <w:r>
         <w:rPr>
@@ -172,14 +123,12 @@
           <w:color w:val="111111"/>
           <w:sz w:val="20"/>
         </w:rPr>
-        <w:t>Individual betting markets across all today's matches passing all three edge filters simultaneously: raw edge &gt;= 4%, 90% CI lower bound above market no-vig price, and market implied &gt; 2%. This is a strict filter -- the count is frequently zero or very small. That is correct behavior. A well-calibrated model should not find edge everywhere in a sharp market.</w:t>
+        <w:t>Individual betting markets across all today's matches passing all three edge filters simultaneously: raw edge &gt;= 4%, 90% confidence interval lower bound still positive, market implied probability &gt; 2%.</w:t>
       </w:r>
     </w:p>
     <w:p>
       <w:pPr>
         <w:pStyle w:val="ListBullet"/>
-        <w:spacing w:before="20" w:after="40"/>
-        <w:ind w:left="432"/>
       </w:pPr>
       <w:r>
         <w:rPr>
@@ -194,14 +143,12 @@
           <w:color w:val="111111"/>
           <w:sz w:val="20"/>
         </w:rPr>
-        <w:t>The single largest edge percentage found across all today's markets, with the specific market and match identified. An edge of +12% means the model estimates that outcome is 12% more likely than the bookmaker's no-vig price implies. It does not mean the bet will win -- it means the price is favorable at the time of prediction.</w:t>
+        <w:t>The single largest edge percentage found across all today's markets, with the specific market and match identified.</w:t>
       </w:r>
     </w:p>
     <w:p>
       <w:pPr>
         <w:pStyle w:val="ListBullet"/>
-        <w:spacing w:before="20" w:after="40"/>
-        <w:ind w:left="432"/>
       </w:pPr>
       <w:r>
         <w:rPr>
@@ -216,15 +163,11 @@
           <w:color w:val="111111"/>
           <w:sz w:val="20"/>
         </w:rPr>
-        <w:t>The average total expected goals across today's fixtures -- the model's best estimate of how many goals each match will produce under current conditions.</w:t>
+        <w:t>The average total expected goals across today's fixtures -- the model's best estimate of how many goals each match will produce.</w:t>
       </w:r>
     </w:p>
     <w:p>
-      <w:pPr>
-        <w:spacing w:before="240" w:after="60"/>
-        <w:keepWithNext/>
-        <w:keepLines/>
-      </w:pPr>
+      <w:pPr/>
       <w:r>
         <w:rPr>
           <w:b/>
@@ -235,10 +178,7 @@
       </w:r>
     </w:p>
     <w:p>
-      <w:pPr>
-        <w:spacing w:before="0" w:after="140"/>
-        <w:jc w:val="both"/>
-      </w:pPr>
+      <w:pPr/>
       <w:r>
         <w:rPr>
           <w:color w:val="111111"/>
@@ -250,8 +190,6 @@
     <w:p>
       <w:pPr>
         <w:pStyle w:val="ListBullet"/>
-        <w:spacing w:before="20" w:after="40"/>
-        <w:ind w:left="432"/>
       </w:pPr>
       <w:r>
         <w:rPr>
@@ -266,14 +204,12 @@
           <w:color w:val="111111"/>
           <w:sz w:val="20"/>
         </w:rPr>
-        <w:t>Theoretically optimal under the Kelly criterion. Produces large drawdowns when edge estimates contain error. Not recommended unless confidence in the edge estimate is very high.</w:t>
+        <w:t>Theoretically optimal under the Kelly criterion. Produces large drawdowns when edge estimates contain error. Not recommended unless you have very high confidence in the model's calibration.</w:t>
       </w:r>
     </w:p>
     <w:p>
       <w:pPr>
         <w:pStyle w:val="ListBullet"/>
-        <w:spacing w:before="20" w:after="40"/>
-        <w:ind w:left="432"/>
       </w:pPr>
       <w:r>
         <w:rPr>
@@ -288,14 +224,12 @@
           <w:color w:val="111111"/>
           <w:sz w:val="20"/>
         </w:rPr>
-        <w:t>Bet size divided by two. Substantially reduces variance while retaining most of the theoretical compounding advantage. The default and standard recommendation.</w:t>
+        <w:t>Bet size divided by two. Substantially reduces variance while retaining most of the theoretical compounding advantage. The default and recommended setting.</w:t>
       </w:r>
     </w:p>
     <w:p>
       <w:pPr>
         <w:pStyle w:val="ListBullet"/>
-        <w:spacing w:before="20" w:after="40"/>
-        <w:ind w:left="432"/>
       </w:pPr>
       <w:r>
         <w:rPr>
@@ -314,10 +248,7 @@
       </w:r>
     </w:p>
     <w:p>
-      <w:pPr>
-        <w:spacing w:before="0" w:after="140"/>
-        <w:jc w:val="both"/>
-      </w:pPr>
+      <w:pPr/>
       <w:r>
         <w:rPr>
           <w:color w:val="111111"/>
@@ -327,11 +258,7 @@
       </w:r>
     </w:p>
     <w:p>
-      <w:pPr>
-        <w:spacing w:before="240" w:after="60"/>
-        <w:keepWithNext/>
-        <w:keepLines/>
-      </w:pPr>
+      <w:pPr/>
       <w:r>
         <w:rPr>
           <w:b/>
@@ -344,8 +271,6 @@
     <w:p>
       <w:pPr>
         <w:pStyle w:val="ListBullet"/>
-        <w:spacing w:before="20" w:after="40"/>
-        <w:ind w:left="432"/>
       </w:pPr>
       <w:r>
         <w:rPr>
@@ -360,14 +285,12 @@
           <w:color w:val="111111"/>
           <w:sz w:val="20"/>
         </w:rPr>
-        <w:t>Home vs away. All matches treated as neutral venue except USA, Canada, and Mexico which carry a small host-advantage adjustment (+0.10 attack, -0.10 defense).</w:t>
+        <w:t>Home vs away. All matches treated as neutral venue except USA, Canada, and Mexico which carry a small host-advantage adjustment (+0.10 attack lambda, -0.10 defense lambda). Altitude multipliers apply at Azteca (0.93x), Akron/Guadalajara (0.97x), and BBVA/Monterrey (1.00x).</w:t>
       </w:r>
     </w:p>
     <w:p>
       <w:pPr>
         <w:pStyle w:val="ListBullet"/>
-        <w:spacing w:before="20" w:after="40"/>
-        <w:ind w:left="432"/>
       </w:pPr>
       <w:r>
         <w:rPr>
@@ -388,8 +311,6 @@
     <w:p>
       <w:pPr>
         <w:pStyle w:val="ListBullet"/>
-        <w:spacing w:before="20" w:after="40"/>
-        <w:ind w:left="432"/>
       </w:pPr>
       <w:r>
         <w:rPr>
@@ -410,8 +331,6 @@
     <w:p>
       <w:pPr>
         <w:pStyle w:val="ListBullet"/>
-        <w:spacing w:before="20" w:after="40"/>
-        <w:ind w:left="432"/>
       </w:pPr>
       <w:r>
         <w:rPr>
@@ -432,8 +351,6 @@
     <w:p>
       <w:pPr>
         <w:pStyle w:val="ListBullet"/>
-        <w:spacing w:before="20" w:after="40"/>
-        <w:ind w:left="432"/>
       </w:pPr>
       <w:r>
         <w:rPr>
@@ -454,8 +371,6 @@
     <w:p>
       <w:pPr>
         <w:pStyle w:val="ListBullet"/>
-        <w:spacing w:before="20" w:after="40"/>
-        <w:ind w:left="432"/>
       </w:pPr>
       <w:r>
         <w:rPr>
@@ -476,8 +391,6 @@
     <w:p>
       <w:pPr>
         <w:pStyle w:val="ListBullet"/>
-        <w:spacing w:before="20" w:after="40"/>
-        <w:ind w:left="432"/>
       </w:pPr>
       <w:r>
         <w:rPr>
@@ -496,11 +409,7 @@
       </w:r>
     </w:p>
     <w:p>
-      <w:pPr>
-        <w:spacing w:before="240" w:after="60"/>
-        <w:keepWithNext/>
-        <w:keepLines/>
-      </w:pPr>
+      <w:pPr/>
       <w:r>
         <w:rPr>
           <w:b/>
@@ -511,10 +420,7 @@
       </w:r>
     </w:p>
     <w:p>
-      <w:pPr>
-        <w:spacing w:before="0" w:after="140"/>
-        <w:jc w:val="both"/>
-      </w:pPr>
+      <w:pPr/>
       <w:r>
         <w:rPr>
           <w:color w:val="111111"/>
@@ -526,8 +432,6 @@
     <w:p>
       <w:pPr>
         <w:pStyle w:val="ListBullet"/>
-        <w:spacing w:before="20" w:after="40"/>
-        <w:ind w:left="432"/>
       </w:pPr>
       <w:r>
         <w:rPr>
@@ -542,14 +446,12 @@
           <w:color w:val="111111"/>
           <w:sz w:val="20"/>
         </w:rPr>
-        <w:t>All non-trivial scorelines ranked from most to least likely, with proportion bars. These are raw joint grid values read directly from the PMF.</w:t>
+        <w:t>All non-trivial scorelines ranked from most to least likely, with proportion bars and fair American odds for each.</w:t>
       </w:r>
     </w:p>
     <w:p>
       <w:pPr>
         <w:pStyle w:val="ListBullet"/>
-        <w:spacing w:before="20" w:after="40"/>
-        <w:ind w:left="432"/>
       </w:pPr>
       <w:r>
         <w:rPr>
@@ -564,14 +466,12 @@
           <w:color w:val="111111"/>
           <w:sz w:val="20"/>
         </w:rPr>
-        <w:t>Every market the engine has priced from the joint grid: 1X2, BTTS, Over/Under at every standard line from 0.5 through 6.5, Draw No Bet, Double Chance, Win to Nil, Asian Handicap, and team-level totals. All from the same single distribution.</w:t>
+        <w:t>Every market the engine has priced from the joint grid: 1X2, BTTS, Over/Under at every standard line from 0.5 through 6.5, Draw No Bet, and Asian Handicap lines.</w:t>
       </w:r>
     </w:p>
     <w:p>
       <w:pPr>
         <w:pStyle w:val="ListBullet"/>
-        <w:spacing w:before="20" w:after="40"/>
-        <w:ind w:left="432"/>
       </w:pPr>
       <w:r>
         <w:rPr>
@@ -586,19 +486,53 @@
           <w:color w:val="111111"/>
           <w:sz w:val="20"/>
         </w:rPr>
-        <w:t>For each market: model probability, market no-vig implied probability, edge %, fair odds, and current market odds. Rows highlighted in gold have passed all three value filters.</w:t>
+        <w:t>For each market: model probability, market no-vig implied probability, edge %, fair odds, and current market odds. Rows highlighted in gold indicate markets passing all three edge filters.</w:t>
       </w:r>
     </w:p>
     <w:p>
-      <w:pPr>
-        <w:keepNext/>
-        <w:spacing w:before="360" w:after="60"/>
-        <w:keepWithNext/>
-        <w:keepLines/>
-        <w:pBdr>
-          <w:bottom w:val="single" w:sz="6" w:space="3" w:color="D4AF37"/>
-        </w:pBdr>
-      </w:pPr>
+      <w:pPr/>
+      <w:r>
+        <w:rPr>
+          <w:b/>
+          <w:color w:val="1A3A6B"/>
+          <w:sz w:val="22"/>
+        </w:rPr>
+        <w:t>First-Half Markets</w:t>
+      </w:r>
+    </w:p>
+    <w:p>
+      <w:pPr/>
+      <w:r>
+        <w:rPr>
+          <w:color w:val="111111"/>
+          <w:sz w:val="20"/>
+        </w:rPr>
+        <w:t>For each match, the model also publishes a first-half probability set: First-Half 1X2, First-Half Over/Under 0.5 and 1.5. These are derived by scaling lambda_home and lambda_away by the empirically calibrated first-half goal share (~47% of expected goals occur in the first 45 minutes at this tournament).</w:t>
+      </w:r>
+    </w:p>
+    <w:p>
+      <w:pPr/>
+      <w:r>
+        <w:rPr>
+          <w:b/>
+          <w:color w:val="1A3A6B"/>
+          <w:sz w:val="22"/>
+        </w:rPr>
+        <w:t>Group-Stage Draw Adjustment</w:t>
+      </w:r>
+    </w:p>
+    <w:p>
+      <w:pPr/>
+      <w:r>
+        <w:rPr>
+          <w:color w:val="111111"/>
+          <w:sz w:val="20"/>
+        </w:rPr>
+        <w:t>During the group stage, the model applies a calibrated draw-probability boost for matches where both teams have similar elimination pressure or are in must-not-lose situations. This adjustment operates at the PMF level -- the draw cells of the joint grid are scaled up and all other markets (O/U, BTTS, correct score) are recomputed from the adjusted grid, maintaining full mathematical consistency across all outputs.</w:t>
+      </w:r>
+    </w:p>
+    <w:p>
+      <w:pPr/>
       <w:r>
         <w:rPr>
           <w:b/>
@@ -609,10 +543,7 @@
       </w:r>
     </w:p>
     <w:p>
-      <w:pPr>
-        <w:spacing w:before="0" w:after="160"/>
-        <w:jc w:val="both"/>
-      </w:pPr>
+      <w:pPr/>
       <w:r>
         <w:rPr>
           <w:color w:val="111111"/>
@@ -622,24 +553,17 @@
       </w:r>
     </w:p>
     <w:p>
-      <w:pPr>
-        <w:spacing w:before="0" w:after="140"/>
-        <w:jc w:val="both"/>
-      </w:pPr>
+      <w:pPr/>
       <w:r>
         <w:rPr>
           <w:color w:val="111111"/>
           <w:sz w:val="20"/>
         </w:rPr>
-        <w:t>Where Page 1 compresses the model output into a single row per match, this page opens it up completely. Select a match using the navigation chips at the top and every chart updates immediately to show the full probability landscape.</w:t>
+        <w:t>Where Page 1 compresses the model output into a single row per match, this page opens it up completely. Select a match using the navigation arrows and every chart and table updates.</w:t>
       </w:r>
     </w:p>
     <w:p>
-      <w:pPr>
-        <w:spacing w:before="240" w:after="60"/>
-        <w:keepWithNext/>
-        <w:keepLines/>
-      </w:pPr>
+      <w:pPr/>
       <w:r>
         <w:rPr>
           <w:b/>
@@ -650,24 +574,17 @@
       </w:r>
     </w:p>
     <w:p>
-      <w:pPr>
-        <w:spacing w:before="0" w:after="140"/>
-        <w:jc w:val="both"/>
-      </w:pPr>
+      <w:pPr/>
       <w:r>
         <w:rPr>
           <w:color w:val="111111"/>
           <w:sz w:val="20"/>
         </w:rPr>
-        <w:t>The heatmap is the model in its purest form. Every cell (h, a) shows the probability that the home team scores exactly h goals and the away team scores exactly a goals. Home goals increase along the vertical axis, away goals along the horizontal. The color scale uses the square root of each cell's probability relative to the grid maximum -- without this transformation, cells above 8% would dominate and everything else would appear uniformly dark. Every betting market is readable directly from this heatmap.</w:t>
+        <w:t>The heatmap is the model in its purest form. Every cell (h, a) shows the probability that the home team scores exactly h goals and the away team scores exactly a goals. Darker gold is higher probability. The diagonal (cells where h = a) represents draws. The upper-left triangle represents away wins. The grid is computed first from the Bivariate Poisson, then adjusted by the SLSQP optimizer, then calibrated by temperature scaling.</w:t>
       </w:r>
     </w:p>
     <w:p>
-      <w:pPr>
-        <w:spacing w:before="240" w:after="60"/>
-        <w:keepWithNext/>
-        <w:keepLines/>
-      </w:pPr>
+      <w:pPr/>
       <w:r>
         <w:rPr>
           <w:b/>
@@ -678,52 +595,37 @@
       </w:r>
     </w:p>
     <w:p>
-      <w:pPr>
-        <w:spacing w:before="0" w:after="140"/>
-        <w:jc w:val="both"/>
-      </w:pPr>
+      <w:pPr/>
       <w:r>
         <w:rPr>
           <w:color w:val="111111"/>
           <w:sz w:val="20"/>
         </w:rPr>
-        <w:t>Two bar charts showing the probability each team scores exactly k goals. The marginal for the home team is obtained by summing across all away goal counts:</w:t>
+        <w:t>Two bar charts showing the probability each team scores exactly k goals. The marginal for the home team is obtained by summing across all away-goal outcomes:</w:t>
       </w:r>
     </w:p>
     <w:p>
-      <w:pPr>
-        <w:spacing w:before="80" w:after="120"/>
-        <w:ind w:left="432" w:right="432"/>
-        <w:shd w:val="clear" w:color="auto" w:fill="EEF2FF"/>
-      </w:pPr>
+      <w:pPr/>
       <w:r>
         <w:rPr>
-          <w:rFonts w:ascii="Courier New" w:hAnsi="Courier New"/>
-          <w:color w:val="1A2060"/>
+          <w:color w:val="111111"/>
           <w:sz w:val="18"/>
         </w:rPr>
         <w:t>P(Home = h) = SUM over all a of  P(Home = h, Away = a)</w:t>
       </w:r>
     </w:p>
     <w:p>
-      <w:pPr>
-        <w:spacing w:before="0" w:after="140"/>
-        <w:jc w:val="both"/>
-      </w:pPr>
+      <w:pPr/>
       <w:r>
         <w:rPr>
           <w:color w:val="111111"/>
           <w:sz w:val="20"/>
         </w:rPr>
-        <w:t>A team with a very tall bar at k=0 is frequently expected to be shut out. The tallest bar for most group-stage matches sits at k=1 for both teams.</w:t>
+        <w:t>A team with a very tall bar at k=0 is frequently expected to be shut out. The tallest bar for most group-stage matches sits at k=1 for both teams, reflecting 2026's high scoring rate calibrated at total_anchor = 3.15 expected goals per match.</w:t>
       </w:r>
     </w:p>
     <w:p>
-      <w:pPr>
-        <w:spacing w:before="240" w:after="60"/>
-        <w:keepWithNext/>
-        <w:keepLines/>
-      </w:pPr>
+      <w:pPr/>
       <w:r>
         <w:rPr>
           <w:b/>
@@ -734,24 +636,17 @@
       </w:r>
     </w:p>
     <w:p>
-      <w:pPr>
-        <w:spacing w:before="0" w:after="140"/>
-        <w:jc w:val="both"/>
-      </w:pPr>
+      <w:pPr/>
       <w:r>
         <w:rPr>
           <w:color w:val="111111"/>
           <w:sz w:val="20"/>
         </w:rPr>
-        <w:t>Shows P(total goals = k) for k = 0, 1, 2, ... Computed by summing all joint PMF cells along each anti-diagonal where h + a = k. Standard over/under lines (0.5, 1.5, 2.5, 3.5, 4.5, 5.5) appear as vertical dividers. The probability to the right of any divider is the Over probability for that line.</w:t>
+        <w:t>Shows P(total goals = k) for k = 0, 1, 2, ... Computed by summing all joint PMF cells along each anti-diagonal where h + a = k. Standard over/under lines at 2.5 and 3.5 are shown as reference lines.</w:t>
       </w:r>
     </w:p>
     <w:p>
-      <w:pPr>
-        <w:spacing w:before="240" w:after="60"/>
-        <w:keepWithNext/>
-        <w:keepLines/>
-      </w:pPr>
+      <w:pPr/>
       <w:r>
         <w:rPr>
           <w:b/>
@@ -762,24 +657,17 @@
       </w:r>
     </w:p>
     <w:p>
-      <w:pPr>
-        <w:spacing w:before="0" w:after="140"/>
-        <w:jc w:val="both"/>
-      </w:pPr>
+      <w:pPr/>
       <w:r>
         <w:rPr>
           <w:color w:val="111111"/>
           <w:sz w:val="20"/>
         </w:rPr>
-        <w:t>Centered on zero. Gold bars are home wins (positive difference), gray is draw, blue is away wins. The height of the gray bar relative to gold and blue tells you how likely a draw is given the specific attacking and defensive qualities of these two teams.</w:t>
+        <w:t>Centered on zero. Gold bars are home wins (positive difference), gray is draw, blue is away wins. The height of the gray bar at zero directly corresponds to the draw probability shown on Page 1.</w:t>
       </w:r>
     </w:p>
     <w:p>
-      <w:pPr>
-        <w:spacing w:before="240" w:after="60"/>
-        <w:keepWithNext/>
-        <w:keepLines/>
-      </w:pPr>
+      <w:pPr/>
       <w:r>
         <w:rPr>
           <w:b/>
@@ -790,24 +678,17 @@
       </w:r>
     </w:p>
     <w:p>
-      <w:pPr>
-        <w:spacing w:before="0" w:after="140"/>
-        <w:jc w:val="both"/>
-      </w:pPr>
+      <w:pPr/>
       <w:r>
         <w:rPr>
           <w:color w:val="111111"/>
           <w:sz w:val="20"/>
         </w:rPr>
-        <w:t>A ranked bar chart of the 20 highest-probability individual final scores with exact percentages and fair American odds. The top cell in most group-stage matches carries between 12% and 20% probability. If your sportsbook offers better odds than the fair odds shown, you may have found a value opportunity.</w:t>
+        <w:t>A ranked bar chart of the 20 highest-probability individual final scores with exact percentages and fair American odds. For the majority of group-stage matches, 1-0 and 1-1 occupy the top two positions, with 2-1 third.</w:t>
       </w:r>
     </w:p>
     <w:p>
-      <w:pPr>
-        <w:spacing w:before="240" w:after="60"/>
-        <w:keepWithNext/>
-        <w:keepLines/>
-      </w:pPr>
+      <w:pPr/>
       <w:r>
         <w:rPr>
           <w:b/>
@@ -818,28 +699,38 @@
       </w:r>
     </w:p>
     <w:p>
-      <w:pPr>
-        <w:spacing w:before="0" w:after="140"/>
-        <w:jc w:val="both"/>
-      </w:pPr>
+      <w:pPr/>
       <w:r>
         <w:rPr>
           <w:color w:val="111111"/>
           <w:sz w:val="20"/>
         </w:rPr>
-        <w:t>Over and Under probabilities for every standard total line from 0.5 through 6.5, all in one place. Every number is computed by summing the appropriate region of the joint PMF -- no approximations.</w:t>
+        <w:t>Over and Under probabilities for every standard total line from 0.5 through 6.5, all in one place. Every number is computed by summing the appropriate cells of the joint PMF grid, not by any separate model.</w:t>
       </w:r>
     </w:p>
     <w:p>
-      <w:pPr>
-        <w:keepNext/>
-        <w:spacing w:before="360" w:after="60"/>
-        <w:keepWithNext/>
-        <w:keepLines/>
-        <w:pBdr>
-          <w:bottom w:val="single" w:sz="6" w:space="3" w:color="D4AF37"/>
-        </w:pBdr>
-      </w:pPr>
+      <w:pPr/>
+      <w:r>
+        <w:rPr>
+          <w:b/>
+          <w:color w:val="1A3A6B"/>
+          <w:sz w:val="22"/>
+        </w:rPr>
+        <w:t>First-Half Probability Table</w:t>
+      </w:r>
+    </w:p>
+    <w:p>
+      <w:pPr/>
+      <w:r>
+        <w:rPr>
+          <w:color w:val="111111"/>
+          <w:sz w:val="20"/>
+        </w:rPr>
+        <w:t>A second table showing First-Half 1X2, First-Half BTTS, and First-Half Over/Under lines (0.5, 1.5) for the selected match. Derived from the same lambdas with a calibrated first-half scaling factor.</w:t>
+      </w:r>
+    </w:p>
+    <w:p>
+      <w:pPr/>
       <w:r>
         <w:rPr>
           <w:b/>
@@ -850,10 +741,7 @@
       </w:r>
     </w:p>
     <w:p>
-      <w:pPr>
-        <w:spacing w:before="0" w:after="160"/>
-        <w:jc w:val="both"/>
-      </w:pPr>
+      <w:pPr/>
       <w:r>
         <w:rPr>
           <w:color w:val="111111"/>
@@ -863,24 +751,17 @@
       </w:r>
     </w:p>
     <w:p>
-      <w:pPr>
-        <w:spacing w:before="0" w:after="140"/>
-        <w:jc w:val="both"/>
-      </w:pPr>
+      <w:pPr/>
       <w:r>
         <w:rPr>
           <w:color w:val="111111"/>
           <w:sz w:val="20"/>
         </w:rPr>
-        <w:t>This page activates when a World Cup match is in progress. When no match is live, it shows the next scheduled kickoff time. All probabilities are regulation time only.</w:t>
+        <w:t>This page activates when a World Cup match is in progress. When no match is live, it shows the next scheduled kickoff time and pre-match probabilities for upcoming fixtures. All probabilities are for the final regulation result -- i.e., what will the score be at the 90+stoppage whistle.</w:t>
       </w:r>
     </w:p>
     <w:p>
-      <w:pPr>
-        <w:spacing w:before="240" w:after="60"/>
-        <w:keepWithNext/>
-        <w:keepLines/>
-      </w:pPr>
+      <w:pPr/>
       <w:r>
         <w:rPr>
           <w:b/>
@@ -891,321 +772,58 @@
       </w:r>
     </w:p>
     <w:p>
-      <w:pPr>
-        <w:spacing w:before="0" w:after="140"/>
-        <w:jc w:val="both"/>
-      </w:pPr>
+      <w:pPr/>
       <w:r>
         <w:rPr>
           <w:color w:val="111111"/>
           <w:sz w:val="20"/>
         </w:rPr>
-        <w:t>The pre-game model asks: what will the final score be from kickoff? The live model asks: given that the current score is H-A at minute t, what will the final score be at 90+ minutes? This is conditional probability. Any score lower than the current score is impossible -- those cells of the PMF grid are locked at zero. The remaining probability redistributes entirely across reachable scores.</w:t>
+        <w:t>The pre-game model asks: what will the final score be from kickoff? The live model asks: given that the current score is H-A at minute t, what will the regulation final score be?</w:t>
       </w:r>
     </w:p>
     <w:p>
-      <w:pPr>
-        <w:spacing w:before="0" w:after="140"/>
-        <w:jc w:val="both"/>
-      </w:pPr>
+      <w:pPr/>
       <w:r>
         <w:rPr>
           <w:color w:val="111111"/>
           <w:sz w:val="20"/>
         </w:rPr>
-        <w:t>The live model uses a non-homogeneous hazard model -- goal-scoring rate varies by match minute, calibrated from 2018 and 2022 World Cup data. Rates are below average in the opening minutes, rise through the mid-half, spike just after half-time, and peak in the final ten minutes. On top of this temporal baseline, score-state multipliers adjust each team's rate based on the current scoreline:</w:t>
+        <w:t>The live model uses a non-homogeneous hazard model -- goal-scoring rate varies by match minute, calibrated from 2018, 2022, and early 2026 World Cup data. Goal-scoring rates peak in minutes 75--90 and near the end of stoppage time. The hazard multiplier adjusts the remaining lambda based on the current scoreline state (level, home leading, away leading by one goal, etc.).</w:t>
       </w:r>
     </w:p>
-    <w:tbl>
-      <w:tblPr>
-        <w:tblStyle w:val="TableGrid"/>
-        <w:tblW w:type="auto" w:w="0"/>
-        <w:tblLook w:firstColumn="1" w:firstRow="1" w:lastColumn="0" w:lastRow="0" w:noHBand="0" w:noVBand="1" w:val="04A0"/>
-      </w:tblPr>
-      <w:tblGrid>
-        <w:gridCol w:w="4536"/>
-        <w:gridCol w:w="4536"/>
-      </w:tblGrid>
-      <w:tr>
-        <w:tc>
-          <w:tcPr>
-            <w:tcW w:type="dxa" w:w="3600"/>
-            <w:shd w:val="clear" w:color="auto" w:fill="0A0E1A"/>
-          </w:tcPr>
-          <w:p>
-            <w:r/>
-            <w:r>
-              <w:rPr>
-                <w:b/>
-                <w:color w:val="D4AF37"/>
-                <w:sz w:val="18"/>
-              </w:rPr>
-              <w:t>Score State</w:t>
-            </w:r>
-          </w:p>
-        </w:tc>
-        <w:tc>
-          <w:tcPr>
-            <w:tcW w:type="dxa" w:w="5400"/>
-            <w:shd w:val="clear" w:color="auto" w:fill="0A0E1A"/>
-          </w:tcPr>
-          <w:p>
-            <w:r/>
-            <w:r>
-              <w:rPr>
-                <w:b/>
-                <w:color w:val="D4AF37"/>
-                <w:sz w:val="18"/>
-              </w:rPr>
-              <w:t>Effect on Goal Rates</w:t>
-            </w:r>
-          </w:p>
-        </w:tc>
-      </w:tr>
-      <w:tr>
-        <w:tc>
-          <w:tcPr>
-            <w:tcW w:type="dxa" w:w="3600"/>
-            <w:shd w:val="clear" w:color="auto" w:fill="FFFFFF"/>
-          </w:tcPr>
-          <w:p>
-            <w:r>
-              <w:rPr>
-                <w:color w:val="111111"/>
-                <w:sz w:val="18"/>
-              </w:rPr>
-              <w:t>Draw at minute 60+</w:t>
-            </w:r>
-          </w:p>
-        </w:tc>
-        <w:tc>
-          <w:tcPr>
-            <w:tcW w:type="dxa" w:w="5400"/>
-            <w:shd w:val="clear" w:color="auto" w:fill="FFFFFF"/>
-          </w:tcPr>
-          <w:p>
-            <w:r>
-              <w:rPr>
-                <w:color w:val="111111"/>
-                <w:sz w:val="18"/>
-              </w:rPr>
-              <w:t>Both teams x1.10 -- games open up in the final 30 minutes</w:t>
-            </w:r>
-          </w:p>
-        </w:tc>
-      </w:tr>
-      <w:tr>
-        <w:tc>
-          <w:tcPr>
-            <w:tcW w:type="dxa" w:w="3600"/>
-            <w:shd w:val="clear" w:color="auto" w:fill="F0F0F0"/>
-          </w:tcPr>
-          <w:p>
-            <w:r>
-              <w:rPr>
-                <w:color w:val="111111"/>
-                <w:sz w:val="18"/>
-              </w:rPr>
-              <w:t>Home team losing by 1</w:t>
-            </w:r>
-          </w:p>
-        </w:tc>
-        <w:tc>
-          <w:tcPr>
-            <w:tcW w:type="dxa" w:w="5400"/>
-            <w:shd w:val="clear" w:color="auto" w:fill="F0F0F0"/>
-          </w:tcPr>
-          <w:p>
-            <w:r>
-              <w:rPr>
-                <w:color w:val="111111"/>
-                <w:sz w:val="18"/>
-              </w:rPr>
-              <w:t>Home x1.25, Away x1.05 -- counter-attack risk increases</w:t>
-            </w:r>
-          </w:p>
-        </w:tc>
-      </w:tr>
-      <w:tr>
-        <w:tc>
-          <w:tcPr>
-            <w:tcW w:type="dxa" w:w="3600"/>
-            <w:shd w:val="clear" w:color="auto" w:fill="FFFFFF"/>
-          </w:tcPr>
-          <w:p>
-            <w:r>
-              <w:rPr>
-                <w:color w:val="111111"/>
-                <w:sz w:val="18"/>
-              </w:rPr>
-              <w:t>Home team losing by 2+</w:t>
-            </w:r>
-          </w:p>
-        </w:tc>
-        <w:tc>
-          <w:tcPr>
-            <w:tcW w:type="dxa" w:w="5400"/>
-            <w:shd w:val="clear" w:color="auto" w:fill="FFFFFF"/>
-          </w:tcPr>
-          <w:p>
-            <w:r>
-              <w:rPr>
-                <w:color w:val="111111"/>
-                <w:sz w:val="18"/>
-              </w:rPr>
-              <w:t>Home x1.40, Away x1.10</w:t>
-            </w:r>
-          </w:p>
-        </w:tc>
-      </w:tr>
-      <w:tr>
-        <w:tc>
-          <w:tcPr>
-            <w:tcW w:type="dxa" w:w="3600"/>
-            <w:shd w:val="clear" w:color="auto" w:fill="F0F0F0"/>
-          </w:tcPr>
-          <w:p>
-            <w:r>
-              <w:rPr>
-                <w:color w:val="111111"/>
-                <w:sz w:val="18"/>
-              </w:rPr>
-              <w:t>Home team winning by 1</w:t>
-            </w:r>
-          </w:p>
-        </w:tc>
-        <w:tc>
-          <w:tcPr>
-            <w:tcW w:type="dxa" w:w="5400"/>
-            <w:shd w:val="clear" w:color="auto" w:fill="F0F0F0"/>
-          </w:tcPr>
-          <w:p>
-            <w:r>
-              <w:rPr>
-                <w:color w:val="111111"/>
-                <w:sz w:val="18"/>
-              </w:rPr>
-              <w:t>Home x0.90, Away x1.10 -- away team pushes forward</w:t>
-            </w:r>
-          </w:p>
-        </w:tc>
-      </w:tr>
-      <w:tr>
-        <w:tc>
-          <w:tcPr>
-            <w:tcW w:type="dxa" w:w="3600"/>
-            <w:shd w:val="clear" w:color="auto" w:fill="FFFFFF"/>
-          </w:tcPr>
-          <w:p>
-            <w:r>
-              <w:rPr>
-                <w:color w:val="111111"/>
-                <w:sz w:val="18"/>
-              </w:rPr>
-              <w:t>Home team winning by 2+</w:t>
-            </w:r>
-          </w:p>
-        </w:tc>
-        <w:tc>
-          <w:tcPr>
-            <w:tcW w:type="dxa" w:w="5400"/>
-            <w:shd w:val="clear" w:color="auto" w:fill="FFFFFF"/>
-          </w:tcPr>
-          <w:p>
-            <w:r>
-              <w:rPr>
-                <w:color w:val="111111"/>
-                <w:sz w:val="18"/>
-              </w:rPr>
-              <w:t>Home x0.80, Away x1.15</w:t>
-            </w:r>
-          </w:p>
-        </w:tc>
-      </w:tr>
-    </w:tbl>
     <w:p>
-      <w:pPr>
-        <w:spacing w:before="0" w:after="120"/>
-      </w:pPr>
-    </w:p>
-    <w:p>
-      <w:pPr>
-        <w:spacing w:before="0" w:after="140"/>
-        <w:jc w:val="both"/>
-      </w:pPr>
+      <w:pPr/>
       <w:r>
         <w:rPr>
           <w:color w:val="111111"/>
           <w:sz w:val="20"/>
         </w:rPr>
-        <w:t>When live expected goals (xG) data is available from BallDontLie, the model blends the live xG rate (60% weight) with the pre-game prior (40% weight) starting from minute 15. Before minute 15, live xG is too noisy to be useful.</w:t>
+        <w:t>When live expected goals (xG) data is available from BallDontLie, the model blends the live xG rate (60% weight) with the pre-game lambda prior (40% weight) to form the remaining goal expectation.</w:t>
       </w:r>
     </w:p>
     <w:p>
-      <w:pPr>
-        <w:spacing w:before="240" w:after="60"/>
-        <w:keepWithNext/>
-        <w:keepLines/>
-      </w:pPr>
+      <w:pPr/>
       <w:r>
         <w:rPr>
           <w:b/>
           <w:color w:val="1A3A6B"/>
           <w:sz w:val="22"/>
         </w:rPr>
-        <w:t>Connection Badge</w:t>
+        <w:t>Connection Mode</w:t>
       </w:r>
     </w:p>
     <w:p>
-      <w:pPr>
-        <w:pStyle w:val="ListBullet"/>
-        <w:spacing w:before="20" w:after="40"/>
-        <w:ind w:left="432"/>
-      </w:pPr>
-      <w:r>
-        <w:rPr>
-          <w:b/>
-          <w:color w:val="111111"/>
-          <w:sz w:val="20"/>
-        </w:rPr>
-        <w:t xml:space="preserve">WebSocket (green): </w:t>
-      </w:r>
+      <w:pPr/>
       <w:r>
         <w:rPr>
           <w:color w:val="111111"/>
           <w:sz w:val="20"/>
         </w:rPr>
-        <w:t>Active push connection. When a goal or status change is reported, the server recomputes the full conditional PMF and pushes it to connected browsers. Target latency: under 200 milliseconds.</w:t>
+        <w:t>The page polls for a new live snapshot every 60 seconds. The refresh countdown is displayed in the header. Each snapshot is a full recomputation of the conditional PMF for the current score and minute.</w:t>
       </w:r>
     </w:p>
     <w:p>
-      <w:pPr>
-        <w:pStyle w:val="ListBullet"/>
-        <w:spacing w:before="20" w:after="40"/>
-        <w:ind w:left="432"/>
-      </w:pPr>
-      <w:r>
-        <w:rPr>
-          <w:b/>
-          <w:color w:val="111111"/>
-          <w:sz w:val="20"/>
-        </w:rPr>
-        <w:t xml:space="preserve">Polling (yellow): </w:t>
-      </w:r>
-      <w:r>
-        <w:rPr>
-          <w:color w:val="111111"/>
-          <w:sz w:val="20"/>
-        </w:rPr>
-        <w:t>Push connection unavailable. The page fetches updated data from a static JSON file every 60 seconds. Updates arrive with up to a one-minute delay. Automatic fallback -- no user action needed.</w:t>
-      </w:r>
-    </w:p>
-    <w:p>
-      <w:pPr>
-        <w:spacing w:before="240" w:after="60"/>
-        <w:keepWithNext/>
-        <w:keepLines/>
-      </w:pPr>
+      <w:pPr/>
       <w:r>
         <w:rPr>
           <w:b/>
@@ -1218,8 +836,6 @@
     <w:p>
       <w:pPr>
         <w:pStyle w:val="ListBullet"/>
-        <w:spacing w:before="20" w:after="40"/>
-        <w:ind w:left="432"/>
       </w:pPr>
       <w:r>
         <w:rPr>
@@ -1240,8 +856,6 @@
     <w:p>
       <w:pPr>
         <w:pStyle w:val="ListBullet"/>
-        <w:spacing w:before="20" w:after="40"/>
-        <w:ind w:left="432"/>
       </w:pPr>
       <w:r>
         <w:rPr>
@@ -1256,14 +870,12 @@
           <w:color w:val="111111"/>
           <w:sz w:val="20"/>
         </w:rPr>
-        <w:t>Next scheduled match with Eastern Time kickoff.</w:t>
+        <w:t>Next scheduled match with Eastern Time kickoff and countdown timer.</w:t>
       </w:r>
     </w:p>
     <w:p>
       <w:pPr>
         <w:pStyle w:val="ListBullet"/>
-        <w:spacing w:before="20" w:after="40"/>
-        <w:ind w:left="432"/>
       </w:pPr>
       <w:r>
         <w:rPr>
@@ -1284,8 +896,6 @@
     <w:p>
       <w:pPr>
         <w:pStyle w:val="ListBullet"/>
-        <w:spacing w:before="20" w:after="40"/>
-        <w:ind w:left="432"/>
       </w:pPr>
       <w:r>
         <w:rPr>
@@ -1304,11 +914,7 @@
       </w:r>
     </w:p>
     <w:p>
-      <w:pPr>
-        <w:spacing w:before="240" w:after="60"/>
-        <w:keepWithNext/>
-        <w:keepLines/>
-      </w:pPr>
+      <w:pPr/>
       <w:r>
         <w:rPr>
           <w:b/>
@@ -1319,24 +925,17 @@
       </w:r>
     </w:p>
     <w:p>
-      <w:pPr>
-        <w:spacing w:before="0" w:after="140"/>
-        <w:jc w:val="both"/>
-      </w:pPr>
+      <w:pPr/>
       <w:r>
         <w:rPr>
           <w:color w:val="111111"/>
           <w:sz w:val="20"/>
         </w:rPr>
-        <w:t>The same three-segment bar as on Page 1 -- Home Win (gold), Draw (gray), Away Win (blue) -- but now conditional on the current score and minute. These are not the probabilities from kickoff. Directly below the bar, the Pre-Game to Live Shift table shows, for each main market, the pre-game probability, the current live probability, and the arithmetic difference. A large shift tells you how significantly the match state has altered the distribution.</w:t>
+        <w:t>The same three-segment bar as on Page 1 -- Home Win (gold), Draw (gray), Away Win (blue) -- but now conditional on the current score and minute. Below it, a shift table shows how each probability has moved since the pre-match baseline, making it easy to see the impact of goals.</w:t>
       </w:r>
     </w:p>
     <w:p>
-      <w:pPr>
-        <w:spacing w:before="240" w:after="60"/>
-        <w:keepWithNext/>
-        <w:keepLines/>
-      </w:pPr>
+      <w:pPr/>
       <w:r>
         <w:rPr>
           <w:b/>
@@ -1347,24 +946,17 @@
       </w:r>
     </w:p>
     <w:p>
-      <w:pPr>
-        <w:spacing w:before="0" w:after="140"/>
-        <w:jc w:val="both"/>
-      </w:pPr>
+      <w:pPr/>
       <w:r>
         <w:rPr>
           <w:color w:val="111111"/>
           <w:sz w:val="20"/>
         </w:rPr>
-        <w:t>A compact line chart showing the home team's win probability from kickoff to the current minute. Sharp upward jumps are home goals; sharp downward drops are away goals. This history accumulates within your browser session and resets on page reload.</w:t>
+        <w:t>A compact line chart showing the home team's win probability from kickoff to the current minute. Sharp upward jumps are home goals; sharp downward drops are away goals. The chart anchors to the pre-game probability at minute 0.</w:t>
       </w:r>
     </w:p>
     <w:p>
-      <w:pPr>
-        <w:spacing w:before="240" w:after="60"/>
-        <w:keepWithNext/>
-        <w:keepLines/>
-      </w:pPr>
+      <w:pPr/>
       <w:r>
         <w:rPr>
           <w:b/>
@@ -1375,24 +967,17 @@
       </w:r>
     </w:p>
     <w:p>
-      <w:pPr>
-        <w:spacing w:before="0" w:after="140"/>
-        <w:jc w:val="both"/>
-      </w:pPr>
+      <w:pPr/>
       <w:r>
         <w:rPr>
           <w:color w:val="111111"/>
           <w:sz w:val="20"/>
         </w:rPr>
-        <w:t>The same heatmap as on Page 2, updated with every live snapshot. The cell corresponding to the current live score is outlined in red. All unreachable cells are forced to zero and appear dark. As the match progresses, the dark region grows and probability concentrates into fewer and fewer bright cells. In stoppage time of a 1-0 match, the heatmap may assign 85-90% probability to the single 1-0 cell.</w:t>
+        <w:t>The same heatmap as on Page 2, updated with every live snapshot. The cell corresponding to the current live score is outlined in red. All unreachable cells (scores that require more goals than have already been scored in the inverse direction) are grayed out.</w:t>
       </w:r>
     </w:p>
     <w:p>
-      <w:pPr>
-        <w:spacing w:before="240" w:after="60"/>
-        <w:keepWithNext/>
-        <w:keepLines/>
-      </w:pPr>
+      <w:pPr/>
       <w:r>
         <w:rPr>
           <w:b/>
@@ -1403,10 +988,7 @@
       </w:r>
     </w:p>
     <w:p>
-      <w:pPr>
-        <w:spacing w:before="0" w:after="140"/>
-        <w:jc w:val="both"/>
-      </w:pPr>
+      <w:pPr/>
       <w:r>
         <w:rPr>
           <w:color w:val="111111"/>
@@ -1416,43 +998,31 @@
       </w:r>
     </w:p>
     <w:p>
-      <w:pPr>
-        <w:spacing w:before="80" w:after="120"/>
-        <w:ind w:left="432" w:right="432"/>
-        <w:shd w:val="clear" w:color="auto" w:fill="EEF2FF"/>
-      </w:pPr>
+      <w:pPr/>
       <w:r>
         <w:rPr>
-          <w:rFonts w:ascii="Courier New" w:hAnsi="Courier New"/>
-          <w:color w:val="1A2060"/>
+          <w:color w:val="111111"/>
           <w:sz w:val="18"/>
         </w:rPr>
         <w:t>Home scores next: lambda_h_rem / (lambda_h_rem + lambda_a_rem)</w:t>
         <w:br/>
         <w:t>Away scores next: lambda_a_rem / (lambda_h_rem + lambda_a_rem)</w:t>
         <w:br/>
-        <w:t>No more goals:   e^(-lambda_h_rem) * e^(-lambda_a_rem)</w:t>
+        <w:t>No more goals:   e^(-(lambda_h_rem + lambda_a_rem))</w:t>
       </w:r>
     </w:p>
     <w:p>
-      <w:pPr>
-        <w:spacing w:before="0" w:after="140"/>
-        <w:jc w:val="both"/>
-      </w:pPr>
+      <w:pPr/>
       <w:r>
         <w:rPr>
           <w:color w:val="111111"/>
           <w:sz w:val="20"/>
         </w:rPr>
-        <w:t>As the match enters stoppage time with small remaining expected goals, the 'No more goals' value typically climbs above 80-90%.</w:t>
+        <w:t>As the match enters stoppage time with small remaining expected goals, the No more goals value typically climbs above 80--90%.</w:t>
       </w:r>
     </w:p>
     <w:p>
-      <w:pPr>
-        <w:spacing w:before="240" w:after="60"/>
-        <w:keepWithNext/>
-        <w:keepLines/>
-      </w:pPr>
+      <w:pPr/>
       <w:r>
         <w:rPr>
           <w:b/>
@@ -1463,28 +1033,565 @@
       </w:r>
     </w:p>
     <w:p>
-      <w:pPr>
-        <w:spacing w:before="0" w:after="140"/>
-        <w:jc w:val="both"/>
-      </w:pPr>
+      <w:pPr/>
       <w:r>
         <w:rPr>
           <w:color w:val="111111"/>
           <w:sz w:val="20"/>
         </w:rPr>
-        <w:t>Same ranked list as Page 2, restricted to reachable outcomes only. The current live score is marked. As the match approaches the final whistle, the probability on the leading score climbs rapidly -- in an 88th-minute 1-0 match, the 1-0 cell may carry 8 or 9 times the probability it held before kickoff.</w:t>
+        <w:t>Same ranked list as Page 2, restricted to reachable outcomes only. The current live score is marked. As the match approaches the final whistle, this list converges to the actual score and the one or two adjacent outcomes.</w:t>
+      </w:r>
+    </w:p>
+    <w:p>
+      <w:pPr/>
+      <w:r>
+        <w:rPr>
+          <w:b/>
+          <w:color w:val="1A3A6B"/>
+          <w:sz w:val="22"/>
+        </w:rPr>
+        <w:t>Recently Completed Matches</w:t>
+      </w:r>
+    </w:p>
+    <w:p>
+      <w:pPr/>
+      <w:r>
+        <w:rPr>
+          <w:color w:val="111111"/>
+          <w:sz w:val="20"/>
+        </w:rPr>
+        <w:t>When a match finishes, it remains visible in the recently-completed section for three hours with the final score. This prevents the page from going blank immediately after the final whistle.</w:t>
+      </w:r>
+    </w:p>
+    <w:p>
+      <w:pPr/>
+      <w:r>
+        <w:rPr>
+          <w:b/>
+          <w:color w:val="111111"/>
+          <w:sz w:val="28"/>
+        </w:rPr>
+        <w:t>Page 4 -- Live Pitch Visualization</w:t>
+      </w:r>
+    </w:p>
+    <w:p>
+      <w:pPr/>
+      <w:r>
+        <w:rPr>
+          <w:color w:val="111111"/>
+          <w:sz w:val="20"/>
+        </w:rPr>
+        <w:t>URL: sportsodds.wizardofodds.com/tools/odds-scanner/predictions/world-cup/live/live-pitch.html</w:t>
+      </w:r>
+    </w:p>
+    <w:p>
+      <w:pPr/>
+      <w:r>
+        <w:rPr>
+          <w:color w:val="111111"/>
+          <w:sz w:val="20"/>
+        </w:rPr>
+        <w:t>The Live Pitch page is the most visually rich of the four. It presents a real-time, top-down visualization of the ongoing match rendered as an SVG football pitch accurate to FIFA specifications (105 x 68 meters). The page polls for a new snapshot every 60 seconds.</w:t>
+      </w:r>
+    </w:p>
+    <w:p>
+      <w:pPr/>
+      <w:r>
+        <w:rPr>
+          <w:b/>
+          <w:color w:val="1A3A6B"/>
+          <w:sz w:val="22"/>
+        </w:rPr>
+        <w:t>The Pitch SVG</w:t>
+      </w:r>
+    </w:p>
+    <w:p>
+      <w:pPr/>
+      <w:r>
+        <w:rPr>
+          <w:color w:val="111111"/>
+          <w:sz w:val="20"/>
+        </w:rPr>
+        <w:t>An accurate FIFA-spec pitch is drawn in SVG: grass stripes, goal nets, penalty areas, center circle, corner arcs, and golden corner flags. Every shot taken during the match is plotted as a marker at its (x, y) coordinate. Marker shape encodes the shot result:</w:t>
       </w:r>
     </w:p>
     <w:p>
       <w:pPr>
-        <w:keepNext/>
-        <w:spacing w:before="360" w:after="60"/>
-        <w:keepWithNext/>
-        <w:keepLines/>
-        <w:pBdr>
-          <w:bottom w:val="single" w:sz="6" w:space="3" w:color="D4AF37"/>
-        </w:pBdr>
+        <w:pStyle w:val="ListBullet"/>
       </w:pPr>
+      <w:r>
+        <w:rPr>
+          <w:b/>
+          <w:color w:val="111111"/>
+          <w:sz w:val="20"/>
+        </w:rPr>
+        <w:t xml:space="preserve">Filled circle with outer ring (goal): </w:t>
+      </w:r>
+      <w:r>
+        <w:rPr>
+          <w:color w:val="111111"/>
+          <w:sz w:val="20"/>
+        </w:rPr>
+        <w:t>Shot that resulted in a goal. Marker size scales with xG value.</w:t>
+      </w:r>
+    </w:p>
+    <w:p>
+      <w:pPr>
+        <w:pStyle w:val="ListBullet"/>
+      </w:pPr>
+      <w:r>
+        <w:rPr>
+          <w:b/>
+          <w:color w:val="111111"/>
+          <w:sz w:val="20"/>
+        </w:rPr>
+        <w:t xml:space="preserve">Filled circle, medium opacity (saved): </w:t>
+      </w:r>
+      <w:r>
+        <w:rPr>
+          <w:color w:val="111111"/>
+          <w:sz w:val="20"/>
+        </w:rPr>
+        <w:t>Shot on target that was saved by the goalkeeper.</w:t>
+      </w:r>
+    </w:p>
+    <w:p>
+      <w:pPr>
+        <w:pStyle w:val="ListBullet"/>
+      </w:pPr>
+      <w:r>
+        <w:rPr>
+          <w:b/>
+          <w:color w:val="111111"/>
+          <w:sz w:val="20"/>
+        </w:rPr>
+        <w:t xml:space="preserve">Diamond outline (blocked): </w:t>
+      </w:r>
+      <w:r>
+        <w:rPr>
+          <w:color w:val="111111"/>
+          <w:sz w:val="20"/>
+        </w:rPr>
+        <w:t>Shot that was blocked before reaching the goalkeeper.</w:t>
+      </w:r>
+    </w:p>
+    <w:p>
+      <w:pPr>
+        <w:pStyle w:val="ListBullet"/>
+      </w:pPr>
+      <w:r>
+        <w:rPr>
+          <w:b/>
+          <w:color w:val="111111"/>
+          <w:sz w:val="20"/>
+        </w:rPr>
+        <w:t xml:space="preserve">Faint empty circle (missed): </w:t>
+      </w:r>
+      <w:r>
+        <w:rPr>
+          <w:color w:val="111111"/>
+          <w:sz w:val="20"/>
+        </w:rPr>
+        <w:t>Shot that went off target or wide.</w:t>
+      </w:r>
+    </w:p>
+    <w:p>
+      <w:pPr/>
+      <w:r>
+        <w:rPr>
+          <w:color w:val="111111"/>
+          <w:sz w:val="20"/>
+        </w:rPr>
+        <w:t>Hovering over any shot marker shows a tooltip: minute, result, scorer name, and xG value.</w:t>
+      </w:r>
+    </w:p>
+    <w:p>
+      <w:pPr/>
+      <w:r>
+        <w:rPr>
+          <w:b/>
+          <w:color w:val="1A3A6B"/>
+          <w:sz w:val="22"/>
+        </w:rPr>
+        <w:t>Scoreboard Bar</w:t>
+      </w:r>
+    </w:p>
+    <w:p>
+      <w:pPr/>
+      <w:r>
+        <w:rPr>
+          <w:color w:val="111111"/>
+          <w:sz w:val="20"/>
+        </w:rPr>
+        <w:t>Across the top of the pitch: team names (colored in national team colors), current score, current match minute, and a three-segment probability bar showing live Home Win / Draw / Away Win percentages. This bar updates with every snapshot.</w:t>
+      </w:r>
+    </w:p>
+    <w:p>
+      <w:pPr/>
+      <w:r>
+        <w:rPr>
+          <w:b/>
+          <w:color w:val="1A3A6B"/>
+          <w:sz w:val="22"/>
+        </w:rPr>
+        <w:t>Stats Panel</w:t>
+      </w:r>
+    </w:p>
+    <w:p>
+      <w:pPr/>
+      <w:r>
+        <w:rPr>
+          <w:color w:val="111111"/>
+          <w:sz w:val="20"/>
+        </w:rPr>
+        <w:t>A panel alongside the pitch shows live match statistics updated from BallDontLie:</w:t>
+      </w:r>
+    </w:p>
+    <w:p>
+      <w:pPr>
+        <w:pStyle w:val="ListBullet"/>
+      </w:pPr>
+      <w:r>
+        <w:rPr>
+          <w:b/>
+          <w:color w:val="111111"/>
+          <w:sz w:val="20"/>
+        </w:rPr>
+        <w:t xml:space="preserve">Win probability bar: </w:t>
+      </w:r>
+      <w:r>
+        <w:rPr>
+          <w:color w:val="111111"/>
+          <w:sz w:val="20"/>
+        </w:rPr>
+        <w:t>Home / Draw / Away percentages for regulation time</w:t>
+      </w:r>
+    </w:p>
+    <w:p>
+      <w:pPr>
+        <w:pStyle w:val="ListBullet"/>
+      </w:pPr>
+      <w:r>
+        <w:rPr>
+          <w:b/>
+          <w:color w:val="111111"/>
+          <w:sz w:val="20"/>
+        </w:rPr>
+        <w:t xml:space="preserve">Possession %: </w:t>
+      </w:r>
+      <w:r>
+        <w:rPr>
+          <w:color w:val="111111"/>
+          <w:sz w:val="20"/>
+        </w:rPr>
+        <w:t>Ball possession percentage for each team</w:t>
+      </w:r>
+    </w:p>
+    <w:p>
+      <w:pPr>
+        <w:pStyle w:val="ListBullet"/>
+      </w:pPr>
+      <w:r>
+        <w:rPr>
+          <w:b/>
+          <w:color w:val="111111"/>
+          <w:sz w:val="20"/>
+        </w:rPr>
+        <w:t xml:space="preserve">Shots / Shots on Target: </w:t>
+      </w:r>
+      <w:r>
+        <w:rPr>
+          <w:color w:val="111111"/>
+          <w:sz w:val="20"/>
+        </w:rPr>
+        <w:t>Running totals for each team</w:t>
+      </w:r>
+    </w:p>
+    <w:p>
+      <w:pPr>
+        <w:pStyle w:val="ListBullet"/>
+      </w:pPr>
+      <w:r>
+        <w:rPr>
+          <w:b/>
+          <w:color w:val="111111"/>
+          <w:sz w:val="20"/>
+        </w:rPr>
+        <w:t xml:space="preserve">xG: </w:t>
+      </w:r>
+      <w:r>
+        <w:rPr>
+          <w:color w:val="111111"/>
+          <w:sz w:val="20"/>
+        </w:rPr>
+        <w:t>Cumulative expected goals for each team</w:t>
+      </w:r>
+    </w:p>
+    <w:p>
+      <w:pPr>
+        <w:pStyle w:val="ListBullet"/>
+      </w:pPr>
+      <w:r>
+        <w:rPr>
+          <w:b/>
+          <w:color w:val="111111"/>
+          <w:sz w:val="20"/>
+        </w:rPr>
+        <w:t xml:space="preserve">Corners, Yellow Cards, Red Cards: </w:t>
+      </w:r>
+      <w:r>
+        <w:rPr>
+          <w:color w:val="111111"/>
+          <w:sz w:val="20"/>
+        </w:rPr>
+        <w:t>Live running totals</w:t>
+      </w:r>
+    </w:p>
+    <w:p>
+      <w:pPr/>
+      <w:r>
+        <w:rPr>
+          <w:b/>
+          <w:color w:val="1A3A6B"/>
+          <w:sz w:val="22"/>
+        </w:rPr>
+        <w:t>Event Feed</w:t>
+      </w:r>
+    </w:p>
+    <w:p>
+      <w:pPr/>
+      <w:r>
+        <w:rPr>
+          <w:color w:val="111111"/>
+          <w:sz w:val="20"/>
+        </w:rPr>
+        <w:t>A chronological log of match events in reverse order (most recent first). Each event shows minute, icon, and team. Supported event types:</w:t>
+      </w:r>
+    </w:p>
+    <w:p>
+      <w:pPr>
+        <w:pStyle w:val="ListBullet"/>
+      </w:pPr>
+      <w:r>
+        <w:rPr>
+          <w:b/>
+          <w:color w:val="111111"/>
+          <w:sz w:val="20"/>
+        </w:rPr>
+        <w:t xml:space="preserve">Goal (⚽): </w:t>
+      </w:r>
+      <w:r>
+        <w:rPr>
+          <w:color w:val="111111"/>
+          <w:sz w:val="20"/>
+        </w:rPr>
+        <w:t>Scorer name and jersey number. Penalty goals and own goals labeled.</w:t>
+      </w:r>
+    </w:p>
+    <w:p>
+      <w:pPr>
+        <w:pStyle w:val="ListBullet"/>
+      </w:pPr>
+      <w:r>
+        <w:rPr>
+          <w:b/>
+          <w:color w:val="111111"/>
+          <w:sz w:val="20"/>
+        </w:rPr>
+        <w:t xml:space="preserve">Yellow Card (🟨): </w:t>
+      </w:r>
+      <w:r>
+        <w:rPr>
+          <w:color w:val="111111"/>
+          <w:sz w:val="20"/>
+        </w:rPr>
+        <w:t>Player name and jersey number.</w:t>
+      </w:r>
+    </w:p>
+    <w:p>
+      <w:pPr>
+        <w:pStyle w:val="ListBullet"/>
+      </w:pPr>
+      <w:r>
+        <w:rPr>
+          <w:b/>
+          <w:color w:val="111111"/>
+          <w:sz w:val="20"/>
+        </w:rPr>
+        <w:t xml:space="preserve">Red Card (🟥): </w:t>
+      </w:r>
+      <w:r>
+        <w:rPr>
+          <w:color w:val="111111"/>
+          <w:sz w:val="20"/>
+        </w:rPr>
+        <w:t>Player name and jersey number.</w:t>
+      </w:r>
+    </w:p>
+    <w:p>
+      <w:pPr>
+        <w:pStyle w:val="ListBullet"/>
+      </w:pPr>
+      <w:r>
+        <w:rPr>
+          <w:b/>
+          <w:color w:val="111111"/>
+          <w:sz w:val="20"/>
+        </w:rPr>
+        <w:t xml:space="preserve">Substitution (↕): </w:t>
+      </w:r>
+      <w:r>
+        <w:rPr>
+          <w:color w:val="111111"/>
+          <w:sz w:val="20"/>
+        </w:rPr>
+        <w:t>Players in and out.</w:t>
+      </w:r>
+    </w:p>
+    <w:p>
+      <w:pPr>
+        <w:pStyle w:val="ListBullet"/>
+      </w:pPr>
+      <w:r>
+        <w:rPr>
+          <w:b/>
+          <w:color w:val="111111"/>
+          <w:sz w:val="20"/>
+        </w:rPr>
+        <w:t xml:space="preserve">Corner, Foul, Offside: </w:t>
+      </w:r>
+      <w:r>
+        <w:rPr>
+          <w:color w:val="111111"/>
+          <w:sz w:val="20"/>
+        </w:rPr>
+        <w:t>Logged with minute and team.</w:t>
+      </w:r>
+    </w:p>
+    <w:p>
+      <w:pPr/>
+      <w:r>
+        <w:rPr>
+          <w:color w:val="111111"/>
+          <w:sz w:val="20"/>
+        </w:rPr>
+        <w:t>When detailed event data is unavailable from the API, the feed is synthesized from the running score and card totals, so the log is always populated.</w:t>
+      </w:r>
+    </w:p>
+    <w:p>
+      <w:pPr/>
+      <w:r>
+        <w:rPr>
+          <w:b/>
+          <w:color w:val="1A3A6B"/>
+          <w:sz w:val="22"/>
+        </w:rPr>
+        <w:t>Multi-Match Selector</w:t>
+      </w:r>
+    </w:p>
+    <w:p>
+      <w:pPr/>
+      <w:r>
+        <w:rPr>
+          <w:color w:val="111111"/>
+          <w:sz w:val="20"/>
+        </w:rPr>
+        <w:t>When two or more World Cup matches are in progress simultaneously -- common during group-stage triple-headers -- a tab bar appears above the pitch. Click any tab to switch the pitch, scoreboard, stats, and event feed to that match. Tabs show the current score and minute for each live game.</w:t>
+      </w:r>
+    </w:p>
+    <w:p>
+      <w:pPr/>
+      <w:r>
+        <w:rPr>
+          <w:b/>
+          <w:color w:val="1A3A6B"/>
+          <w:sz w:val="22"/>
+        </w:rPr>
+        <w:t>Quiet State (No Match in Progress)</w:t>
+      </w:r>
+    </w:p>
+    <w:p>
+      <w:pPr/>
+      <w:r>
+        <w:rPr>
+          <w:color w:val="111111"/>
+          <w:sz w:val="20"/>
+        </w:rPr>
+        <w:t>When no match is live, the pitch dims and the center circle displays:</w:t>
+      </w:r>
+    </w:p>
+    <w:p>
+      <w:pPr>
+        <w:pStyle w:val="ListBullet"/>
+      </w:pPr>
+      <w:r>
+        <w:rPr>
+          <w:b/>
+          <w:color w:val="111111"/>
+          <w:sz w:val="20"/>
+        </w:rPr>
+        <w:t xml:space="preserve">Recently completed FT scores </w:t>
+      </w:r>
+      <w:r>
+        <w:rPr>
+          <w:color w:val="111111"/>
+          <w:sz w:val="20"/>
+        </w:rPr>
+        <w:t>with AET/penalty shootout notation</w:t>
+      </w:r>
+    </w:p>
+    <w:p>
+      <w:pPr>
+        <w:pStyle w:val="ListBullet"/>
+      </w:pPr>
+      <w:r>
+        <w:rPr>
+          <w:b/>
+          <w:color w:val="111111"/>
+          <w:sz w:val="20"/>
+        </w:rPr>
+        <w:t xml:space="preserve">A countdown timer </w:t>
+      </w:r>
+      <w:r>
+        <w:rPr>
+          <w:color w:val="111111"/>
+          <w:sz w:val="20"/>
+        </w:rPr>
+        <w:t>to the next scheduled kickoff</w:t>
+      </w:r>
+    </w:p>
+    <w:p>
+      <w:pPr>
+        <w:pStyle w:val="ListBullet"/>
+      </w:pPr>
+      <w:r>
+        <w:rPr>
+          <w:b/>
+          <w:color w:val="111111"/>
+          <w:sz w:val="20"/>
+        </w:rPr>
+        <w:t xml:space="preserve">Pre-match probabilities </w:t>
+      </w:r>
+      <w:r>
+        <w:rPr>
+          <w:color w:val="111111"/>
+          <w:sz w:val="20"/>
+        </w:rPr>
+        <w:t>(Home Win / Draw / Away Win) for each upcoming match today</w:t>
+      </w:r>
+    </w:p>
+    <w:p>
+      <w:pPr/>
+      <w:r>
+        <w:rPr>
+          <w:color w:val="111111"/>
+          <w:sz w:val="20"/>
+        </w:rPr>
+        <w:t>The quiet-state data is refreshed every morning by the daily pipeline, so upcoming match probabilities are always current.</w:t>
+      </w:r>
+    </w:p>
+    <w:p>
+      <w:pPr/>
       <w:r>
         <w:rPr>
           <w:b/>
@@ -1497,8 +1604,6 @@
     <w:p>
       <w:pPr>
         <w:pStyle w:val="ListBullet"/>
-        <w:spacing w:before="20" w:after="40"/>
-        <w:ind w:left="432"/>
       </w:pPr>
       <w:r>
         <w:rPr>
@@ -1511,81 +1616,66 @@
     <w:p>
       <w:pPr>
         <w:pStyle w:val="ListBullet"/>
-        <w:spacing w:before="20" w:after="40"/>
-        <w:ind w:left="432"/>
       </w:pPr>
       <w:r>
         <w:rPr>
           <w:color w:val="111111"/>
           <w:sz w:val="20"/>
         </w:rPr>
-        <w:t>The Bivariate Poisson substantially reduces the independence assumption (lambda_3 = 0.170 captures positive correlation), but it remains an approximation. Score-state multipliers in the live model provide additional correction.</w:t>
+        <w:t>The Dixon-Coles / Bivariate Poisson correlation parameter rho is currently calibrated at -0.20 on 26 completed WC2026 matches. This negative value reflects the World Cup pattern where the trailing team attacks and the leading team defends, reducing true score correlation slightly below zero.</w:t>
       </w:r>
     </w:p>
     <w:p>
       <w:pPr>
         <w:pStyle w:val="ListBullet"/>
-        <w:spacing w:before="20" w:after="40"/>
-        <w:ind w:left="432"/>
       </w:pPr>
       <w:r>
         <w:rPr>
           <w:color w:val="111111"/>
           <w:sz w:val="20"/>
         </w:rPr>
-        <w:t>Calibration rests on 128 World Cup matches from 2018 and 2022, growing as 2026 results accumulate. Metrics carry meaningful statistical uncertainty at this sample size.</w:t>
+        <w:t>The total goals anchor (total_anchor) is currently calibrated at 3.15 expected goals per match from 26 WC2026 results, reflecting this tournament's historically high scoring rate.</w:t>
       </w:r>
     </w:p>
     <w:p>
       <w:pPr>
         <w:pStyle w:val="ListBullet"/>
-        <w:spacing w:before="20" w:after="40"/>
-        <w:ind w:left="432"/>
       </w:pPr>
       <w:r>
         <w:rPr>
           <w:color w:val="111111"/>
           <w:sz w:val="20"/>
         </w:rPr>
-        <w:t>Edge estimates are outputs of a probabilistic model. Market odds move between prediction time and kickoff. Always verify current prices at your book before acting.</w:t>
+        <w:t>Edge estimates are outputs of a probabilistic model. Market odds move between prediction time and kickoff. Always verify current prices at your bookmaker before placing any bet.</w:t>
       </w:r>
     </w:p>
     <w:p>
       <w:pPr>
         <w:pStyle w:val="ListBullet"/>
-        <w:spacing w:before="20" w:after="40"/>
-        <w:ind w:left="432"/>
       </w:pPr>
       <w:r>
         <w:rPr>
           <w:color w:val="111111"/>
           <w:sz w:val="20"/>
         </w:rPr>
-        <w:t>WebSocket update speed is subject to network latency and server load. The stated target of under 200 milliseconds applies under normal conditions.</w:t>
+        <w:t>First-half markets are derived from a fixed first-half scaling factor calibrated on historical World Cup data. They do not incorporate live first-half data.</w:t>
       </w:r>
     </w:p>
     <w:p>
       <w:pPr>
-        <w:spacing w:before="0" w:after="240"/>
-      </w:pPr>
-    </w:p>
-    <w:p>
-      <w:pPr>
-        <w:spacing w:before="320"/>
-        <w:jc w:val="center"/>
+        <w:pStyle w:val="ListBullet"/>
       </w:pPr>
       <w:r>
         <w:rPr>
-          <w:i/>
-          <w:color w:val="555555"/>
-          <w:sz w:val="16"/>
+          <w:color w:val="111111"/>
+          <w:sz w:val="20"/>
         </w:rPr>
-        <w:t>All probabilities represent regulation time (90 minutes + stoppage time) only. Extra time and penalties are excluded. This article is for informational and educational purposes. Please gamble responsibly. WizardOfOdds.com</w:t>
+        <w:t>This article is for informational and entertainment purposes only. It does not constitute financial or betting advice.</w:t>
       </w:r>
     </w:p>
     <w:sectPr>
       <w:pgSz w:w="12240" w:h="15840"/>
-      <w:pgMar w:top="1440" w:right="1584" w:bottom="1440" w:left="1584" w:header="720" w:footer="720" w:gutter="0"/>
+      <w:pgMar w:top="1440" w:right="1800" w:bottom="1440" w:left="1800" w:header="720" w:footer="720" w:gutter="0"/>
       <w:cols w:space="720"/>
       <w:docGrid w:linePitch="360"/>
     </w:sectPr>

</xml_diff>